<commit_message>
Regenerate PDF/DOCX exports for the R17 risk register updates
Rebuilds the appendix PDFs and the merged DEQUAD_UKES_FULL_SUBMISSION.pdf
via build_ukes_pdf.py (first attempt hit a transient chromium timeout
on an unrelated file; retry succeeded), and the Risk Register/Decision
Brief/Full Submission DOCX exports via pandoc.

Co-Authored-By: Claude Sonnet 5 <noreply@anthropic.com>
</commit_message>
<xml_diff>
--- a/visa_appendices/docx/DEQUAD_Risk_Register.docx
+++ b/visa_appendices/docx/DEQUAD_Risk_Register.docx
@@ -2,14 +2,6 @@
 <file path=word/document.xml><?xml version="1.0" encoding="utf-8"?>
 <w:document xmlns:w="http://schemas.openxmlformats.org/wordprocessingml/2006/main" xmlns:m="http://schemas.openxmlformats.org/officeDocument/2006/math" xmlns:r="http://schemas.openxmlformats.org/officeDocument/2006/relationships" xmlns:o="urn:schemas-microsoft-com:office:office" xmlns:v="urn:schemas-microsoft-com:vml" xmlns:w10="urn:schemas-microsoft-com:office:word" xmlns:a="http://schemas.openxmlformats.org/drawingml/2006/main" xmlns:pic="http://schemas.openxmlformats.org/drawingml/2006/picture" xmlns:wp="http://schemas.openxmlformats.org/drawingml/2006/wordprocessingDrawing">
   <w:body>
-    <w:p>
-      <w:pPr>
-        <w:pStyle w:val="Title"/>
-      </w:pPr>
-      <w:r>
-        <w:t xml:space="preserve">DEQUAD_Risk_Register</w:t>
-      </w:r>
-    </w:p>
     <w:bookmarkStart w:id="15" w:name="dequad-risk-register"/>
     <w:p>
       <w:pPr>
@@ -49,7 +41,7 @@
         <w:t xml:space="preserve"> </w:t>
       </w:r>
       <w:r>
-        <w:t xml:space="preserve">business plan. This document enumerates the 16 most material risks</w:t>
+        <w:t xml:space="preserve">business plan. This document enumerates the 17 most material risks</w:t>
       </w:r>
       <w:r>
         <w:t xml:space="preserve"> </w:t>
@@ -926,7 +918,7 @@
               <w:pStyle w:val="Compact"/>
             </w:pPr>
             <w:r>
-              <w:t xml:space="preserve">The plan does not require a funding round to remain solvent at any point (Section 10) — the only consequence of missing revenue targets is that the single Y3 hire and modest founder pay are delayed, not that the business fails. £6,000 founder cash plus minimal fixed costs (Section 12) carry the business with positive month-end balances even in a zero-institutional-revenue scenario.</w:t>
+              <w:t xml:space="preserve">The plan does not require a funding round to remain solvent at any point (Section 10) — the only consequence of missing revenue targets is that the base-case Y3 hire and modest founder pay are delayed, not that the business fails. The upside-case job-creation target of 5 full-time hires (§10.4, Appendix G) simply does not trigger if revenue doesn’t scale to 6+ paying universities — see R17 for the settlement-specific consequence of that. £6,000 founder cash plus minimal fixed costs (Section 12) carry the business with positive month-end balances even in a zero-institutional-revenue scenario.</w:t>
             </w:r>
           </w:p>
         </w:tc>
@@ -2482,6 +2474,134 @@
             </w:pPr>
             <w:r>
               <w:t xml:space="preserve">Founders draw no DEQUAD salary until Y3, and fund living costs from existing employment/freelance income throughout — a deliberate, disclosed choice, not a funding-gated one; mandated weekly off-day; mentor check-ins through NatWest Accelerator.</w:t>
+            </w:r>
+          </w:p>
+        </w:tc>
+      </w:tr>
+      <w:tr>
+        <w:tc>
+          <w:tcPr/>
+          <w:p>
+            <w:pPr>
+              <w:pStyle w:val="Compact"/>
+            </w:pPr>
+            <w:r>
+              <w:rPr>
+                <w:b/>
+                <w:bCs/>
+              </w:rPr>
+              <w:t xml:space="preserve">R17</w:t>
+            </w:r>
+          </w:p>
+        </w:tc>
+        <w:tc>
+          <w:tcPr/>
+          <w:p>
+            <w:pPr>
+              <w:pStyle w:val="Compact"/>
+            </w:pPr>
+            <w:r>
+              <w:rPr>
+                <w:b/>
+                <w:bCs/>
+              </w:rPr>
+              <w:t xml:space="preserve">5-hire job-creation target (upside case) not achieved by the settlement application stage</w:t>
+            </w:r>
+          </w:p>
+        </w:tc>
+        <w:tc>
+          <w:tcPr/>
+          <w:p>
+            <w:pPr>
+              <w:pStyle w:val="Compact"/>
+            </w:pPr>
+            <w:r>
+              <w:t xml:space="preserve">Regulatory / Commercial</w:t>
+            </w:r>
+          </w:p>
+        </w:tc>
+        <w:tc>
+          <w:tcPr/>
+          <w:p>
+            <w:pPr>
+              <w:pStyle w:val="Compact"/>
+              <w:jc w:val="right"/>
+            </w:pPr>
+            <w:r>
+              <w:t xml:space="preserve">3</w:t>
+            </w:r>
+          </w:p>
+        </w:tc>
+        <w:tc>
+          <w:tcPr/>
+          <w:p>
+            <w:pPr>
+              <w:pStyle w:val="Compact"/>
+              <w:jc w:val="right"/>
+            </w:pPr>
+            <w:r>
+              <w:t xml:space="preserve">3</w:t>
+            </w:r>
+          </w:p>
+        </w:tc>
+        <w:tc>
+          <w:tcPr/>
+          <w:p>
+            <w:pPr>
+              <w:pStyle w:val="Compact"/>
+              <w:jc w:val="right"/>
+            </w:pPr>
+            <w:r>
+              <w:rPr>
+                <w:b/>
+                <w:bCs/>
+              </w:rPr>
+              <w:t xml:space="preserve">9</w:t>
+            </w:r>
+          </w:p>
+        </w:tc>
+        <w:tc>
+          <w:tcPr/>
+          <w:p>
+            <w:pPr>
+              <w:pStyle w:val="Compact"/>
+            </w:pPr>
+            <w:r>
+              <w:t xml:space="preserve">🟡</w:t>
+            </w:r>
+          </w:p>
+        </w:tc>
+        <w:tc>
+          <w:tcPr/>
+          <w:p>
+            <w:pPr>
+              <w:pStyle w:val="Compact"/>
+            </w:pPr>
+            <w:r>
+              <w:t xml:space="preserve">CEO</w:t>
+            </w:r>
+          </w:p>
+        </w:tc>
+        <w:tc>
+          <w:tcPr/>
+          <w:p>
+            <w:pPr>
+              <w:pStyle w:val="Compact"/>
+            </w:pPr>
+            <w:r>
+              <w:t xml:space="preserve">The job-creation target (§10.4, Appendix G) is presented throughout this application as an illustrative, revenue-contingent upside — not a commitment to UKES — so falling short of it does not itself breach any undertaking made here. It is contingent on institutional revenue scaling to 6+ paying universities (Appendix F,</w:t>
+            </w:r>
+            <w:r>
+              <w:t xml:space="preserve"> </w:t>
+            </w:r>
+            <w:r>
+              <w:t xml:space="preserve">“Upside Case (Y3)”</w:t>
+            </w:r>
+            <w:r>
+              <w:t xml:space="preserve"> </w:t>
+            </w:r>
+            <w:r>
+              <w:t xml:space="preserve">sheet), which is not assumed in the conservative base case this plan is built on. If settlement timing requires the job-creation route specifically, the founders would delay the settlement application until either this target or an alternative Home Office settlement criterion (e.g. business-growth metrics) is genuinely met, rather than presenting an unfunded commitment as achieved.</w:t>
             </w:r>
           </w:p>
         </w:tc>

</xml_diff>

<commit_message>
Regenerate PDF/DOCX exports for the R3/R17 RAG color fix
Rebuilds all appendix PDFs and the merged DEQUAD_UKES_FULL_SUBMISSION.pdf
via build_ukes_pdf.py, and the Risk Register/Full Submission DOCX
exports via pandoc.

Co-Authored-By: Claude Sonnet 5 <noreply@anthropic.com>
</commit_message>
<xml_diff>
--- a/visa_appendices/docx/DEQUAD_Risk_Register.docx
+++ b/visa_appendices/docx/DEQUAD_Risk_Register.docx
@@ -896,7 +896,7 @@
               <w:pStyle w:val="Compact"/>
             </w:pPr>
             <w:r>
-              <w:t xml:space="preserve">🟡</w:t>
+              <w:t xml:space="preserve">🟠</w:t>
             </w:r>
           </w:p>
         </w:tc>
@@ -2567,7 +2567,7 @@
               <w:pStyle w:val="Compact"/>
             </w:pPr>
             <w:r>
-              <w:t xml:space="preserve">🟡</w:t>
+              <w:t xml:space="preserve">🟠</w:t>
             </w:r>
           </w:p>
         </w:tc>

</xml_diff>